<commit_message>
Prerequisites learning is now complete for project the khoji copy is also made for learning purposes which is not a direct clone but similar working but original source code, now we move to final exe build for our completed final project
</commit_message>
<xml_diff>
--- a/Prerequisites/Frontend Learning/Working-Report.docx
+++ b/Prerequisites/Frontend Learning/Working-Report.docx
@@ -10,6 +10,9 @@
     <w:p/>
     <w:p>
       <w:r>
+        <w:rPr>
+          <w:noProof/>
+        </w:rPr>
         <w:drawing>
           <wp:inline distT="0" distB="0" distL="0" distR="0" wp14:anchorId="4F1043F3" wp14:editId="2285497D">
             <wp:extent cx="5731510" cy="2178050"/>
@@ -65,6 +68,9 @@
     </w:p>
     <w:p>
       <w:r>
+        <w:rPr>
+          <w:noProof/>
+        </w:rPr>
         <w:drawing>
           <wp:inline distT="0" distB="0" distL="0" distR="0" wp14:anchorId="508AD838" wp14:editId="75EFCBDE">
             <wp:extent cx="5731510" cy="3103880"/>
@@ -544,6 +550,9 @@
         </w:rPr>
       </w:pPr>
       <w:r>
+        <w:rPr>
+          <w:noProof/>
+        </w:rPr>
         <w:drawing>
           <wp:inline distT="0" distB="0" distL="0" distR="0" wp14:anchorId="7872D912" wp14:editId="323BD971">
             <wp:extent cx="2651722" cy="1094509"/>
@@ -593,6 +602,9 @@
         <w:t xml:space="preserve">      </w:t>
       </w:r>
       <w:r>
+        <w:rPr>
+          <w:noProof/>
+        </w:rPr>
         <w:drawing>
           <wp:inline distT="0" distB="0" distL="0" distR="0" wp14:anchorId="795F947E" wp14:editId="354437A7">
             <wp:extent cx="2389909" cy="1089138"/>
@@ -841,10 +853,10 @@
     <w:p>
       <w:r>
         <w:drawing>
-          <wp:inline distT="0" distB="0" distL="0" distR="0" wp14:anchorId="42150A20" wp14:editId="59721578">
-            <wp:extent cx="5731510" cy="1667510"/>
-            <wp:effectExtent l="0" t="0" r="2540" b="8890"/>
-            <wp:docPr id="1003420199" name="Picture 1"/>
+          <wp:inline distT="0" distB="0" distL="0" distR="0" wp14:anchorId="04B5D3C9" wp14:editId="26C022F9">
+            <wp:extent cx="5731510" cy="2212340"/>
+            <wp:effectExtent l="0" t="0" r="2540" b="0"/>
+            <wp:docPr id="985793813" name="Picture 1"/>
             <wp:cNvGraphicFramePr>
               <a:graphicFrameLocks xmlns:a="http://schemas.openxmlformats.org/drawingml/2006/main" noChangeAspect="1"/>
             </wp:cNvGraphicFramePr>
@@ -852,7 +864,7 @@
               <a:graphicData uri="http://schemas.openxmlformats.org/drawingml/2006/picture">
                 <pic:pic xmlns:pic="http://schemas.openxmlformats.org/drawingml/2006/picture">
                   <pic:nvPicPr>
-                    <pic:cNvPr id="1003420199" name=""/>
+                    <pic:cNvPr id="985793813" name=""/>
                     <pic:cNvPicPr/>
                   </pic:nvPicPr>
                   <pic:blipFill>
@@ -864,7 +876,7 @@
                   <pic:spPr>
                     <a:xfrm>
                       <a:off x="0" y="0"/>
-                      <a:ext cx="5731510" cy="1667510"/>
+                      <a:ext cx="5731510" cy="2212340"/>
                     </a:xfrm>
                     <a:prstGeom prst="rect">
                       <a:avLst/>
@@ -884,84 +896,85 @@
     </w:p>
     <w:p>
       <w:r>
-        <w:t xml:space="preserve">Added </w:t>
+        <w:t>"dev": "concurrently \"</w:t>
       </w:r>
       <w:proofErr w:type="spellStart"/>
+      <w:r>
+        <w:t>vite</w:t>
+      </w:r>
+      <w:proofErr w:type="spellEnd"/>
+      <w:r>
+        <w:t xml:space="preserve"> --host 127.0.0.1\" \"wait-on http://127.0.0.1:5173 &amp;&amp; cross-env VITE_DEV_SERVER_URL=http://127.0.0.1:5173 </w:t>
+      </w:r>
       <w:proofErr w:type="gramStart"/>
       <w:r>
-        <w:t>electron:dev</w:t>
+        <w:t>electron .</w:t>
+      </w:r>
+      <w:proofErr w:type="gramEnd"/>
+      <w:r>
+        <w:t>\"",</w:t>
+      </w:r>
+    </w:p>
+    <w:p>
+      <w:r>
+        <w:t>Step6:</w:t>
+      </w:r>
+    </w:p>
+    <w:p>
+      <w:r>
+        <w:t xml:space="preserve">Do  </w:t>
+      </w:r>
+      <w:r>
+        <w:t xml:space="preserve"> </w:t>
+      </w:r>
+      <w:r>
+        <w:tab/>
+      </w:r>
+      <w:proofErr w:type="spellStart"/>
+      <w:r>
+        <w:t>npm</w:t>
       </w:r>
       <w:proofErr w:type="spellEnd"/>
+      <w:r>
+        <w:t xml:space="preserve"> install --save-dev cross-env</w:t>
+      </w:r>
+    </w:p>
+    <w:p>
+      <w:r>
+        <w:t xml:space="preserve"> to install cross-env ………</w:t>
+      </w:r>
+      <w:proofErr w:type="gramStart"/>
+      <w:r>
+        <w:t>….then</w:t>
+      </w:r>
       <w:proofErr w:type="gramEnd"/>
       <w:r>
-        <w:t xml:space="preserve"> and </w:t>
+        <w:t xml:space="preserve"> </w:t>
+      </w:r>
+    </w:p>
+    <w:p>
+      <w:r>
+        <w:t xml:space="preserve"> </w:t>
+      </w:r>
+      <w:proofErr w:type="gramStart"/>
+      <w:r>
+        <w:t xml:space="preserve">do </w:t>
+      </w:r>
+      <w:r>
+        <w:t xml:space="preserve"> </w:t>
+      </w:r>
+      <w:r>
+        <w:tab/>
       </w:r>
       <w:proofErr w:type="spellStart"/>
-      <w:proofErr w:type="gramStart"/>
-      <w:r>
-        <w:t>electron:preview</w:t>
+      <w:proofErr w:type="gramEnd"/>
+      <w:r>
+        <w:t>npm</w:t>
       </w:r>
       <w:proofErr w:type="spellEnd"/>
-      <w:proofErr w:type="gramEnd"/>
-      <w:r>
-        <w:t xml:space="preserve"> for concurrently running both and wait on stuff.</w:t>
-      </w:r>
-    </w:p>
-    <w:p>
-      <w:r>
-        <w:t>Step6:</w:t>
-      </w:r>
-    </w:p>
-    <w:p>
-      <w:proofErr w:type="gramStart"/>
-      <w:r>
-        <w:t>Do  -</w:t>
-      </w:r>
-      <w:proofErr w:type="gramEnd"/>
-      <w:r>
-        <w:t xml:space="preserve"> </w:t>
-      </w:r>
-      <w:proofErr w:type="spellStart"/>
-      <w:r>
-        <w:t>npm</w:t>
-      </w:r>
-      <w:proofErr w:type="spellEnd"/>
-      <w:r>
-        <w:t xml:space="preserve"> install --save-dev cross-env</w:t>
-      </w:r>
-    </w:p>
-    <w:p>
-      <w:r>
-        <w:t xml:space="preserve"> to install cross-env ………</w:t>
-      </w:r>
-      <w:proofErr w:type="gramStart"/>
-      <w:r>
-        <w:t>….then</w:t>
-      </w:r>
-      <w:proofErr w:type="gramEnd"/>
-      <w:r>
-        <w:t xml:space="preserve"> </w:t>
-      </w:r>
-    </w:p>
-    <w:p>
-      <w:r>
-        <w:t xml:space="preserve"> do - </w:t>
-      </w:r>
-      <w:proofErr w:type="spellStart"/>
-      <w:r>
-        <w:t>npm</w:t>
-      </w:r>
-      <w:proofErr w:type="spellEnd"/>
-      <w:r>
-        <w:t xml:space="preserve"> run </w:t>
-      </w:r>
-      <w:proofErr w:type="spellStart"/>
-      <w:proofErr w:type="gramStart"/>
-      <w:r>
-        <w:t>electron:dev</w:t>
-      </w:r>
-      <w:proofErr w:type="spellEnd"/>
-      <w:proofErr w:type="gramEnd"/>
+      <w:r>
+        <w:t xml:space="preserve"> run dev</w:t>
+      </w:r>
       <w:r>
         <w:t xml:space="preserve"> </w:t>
       </w:r>
@@ -1045,6 +1058,9 @@
     </w:p>
     <w:p>
       <w:r>
+        <w:rPr>
+          <w:noProof/>
+        </w:rPr>
         <w:lastRenderedPageBreak/>
         <w:drawing>
           <wp:inline distT="0" distB="0" distL="0" distR="0" wp14:anchorId="69850530" wp14:editId="5E40CA8F">

</xml_diff>